<commit_message>
Publish What If volume 348 with ISBN, $23 price and human–AI thinking cover
</commit_message>
<xml_diff>
--- a/public/books/what-if/what-if-v1.1.docx
+++ b/public/books/what-if/what-if-v1.1.docx
@@ -28,12 +28,12 @@
               <a:graphicData uri="http://schemas.openxmlformats.org/drawingml/2006/picture">
                 <pic:pic>
                   <pic:nvPicPr>
-                    <pic:cNvPr id="0" name="cover.png"/>
+                    <pic:cNvPr id="0" name="cover-thinking.png"/>
                     <pic:cNvPicPr/>
                   </pic:nvPicPr>
                   <pic:blipFill>
                     <a:blip r:embed="rId11"/>
-                    <a:srcRect l="166" r="166"/>
+                    <a:srcRect l="132" r="132"/>
                     <a:stretch>
                       <a:fillRect/>
                     </a:stretch>
@@ -104,6 +104,14 @@
         <w:pStyle w:val="BookMetadata"/>
       </w:pPr>
       <w:r>
+        <w:t>德麦国际专著第348号 · ISBN 979-8-90690-334-1 · 定价 US$23.00</w:t>
+      </w:r>
+    </w:p>
+    <w:p>
+      <w:pPr>
+        <w:pStyle w:val="BookMetadata"/>
+      </w:pPr>
+      <w:r>
         <w:t>德麦国际出版社  Demai International Press</w:t>
       </w:r>
     </w:p>
@@ -137,7 +145,7 @@
         <w:pStyle w:val="BookFront"/>
       </w:pPr>
       <w:r>
-        <w:t>本版基于完整初稿进行阅读版式整理，保留正文、原生方程与可填写表格。已完成章节合并、术语一致性、结构与重复检查；尚非外部同行评议或最终出版定稿。</w:t>
+        <w:t>本版为数字阅读版，保留正文、原生方程与可填写表格。已完成章节合并、术语一致性、结构、重复与版式检查；未经过外部同行评议。案例与演示性数据的使用边界见前述说明。</w:t>
       </w:r>
     </w:p>
     <w:p>

</xml_diff>